<commit_message>
Preenchendo o Plano de Trabalho.
</commit_message>
<xml_diff>
--- a/Faculdade/Plano-de-Trabalho.docx
+++ b/Faculdade/Plano-de-Trabalho.docx
@@ -255,7 +255,7 @@
                 <w:szCs w:val="24"/>
                 <w:lang w:val="pt-BR"/>
               </w:rPr>
-              <w:t>Larissa Viana Macedo</w:t>
+              <w:t>Tarcísio José Martins Ribeiro</w:t>
             </w:r>
             <w:r>
               <w:rPr>
@@ -347,7 +347,15 @@
                 <w:szCs w:val="24"/>
                 <w:lang w:val="pt-BR"/>
               </w:rPr>
-              <w:t>21291</w:t>
+              <w:t>2</w:t>
+            </w:r>
+            <w:r>
+              <w:rPr>
+                <w:sz w:val="24"/>
+                <w:szCs w:val="24"/>
+                <w:lang w:val="pt-BR"/>
+              </w:rPr>
+              <w:t>0382</w:t>
             </w:r>
             <w:r>
               <w:rPr>
@@ -803,7 +811,7 @@
                 <w:szCs w:val="24"/>
                 <w:lang w:val="pt-BR"/>
               </w:rPr>
-              <w:t>16</w:t>
+              <w:t>35</w:t>
             </w:r>
             <w:r>
               <w:rPr>
@@ -868,7 +876,16 @@
                 <w:szCs w:val="24"/>
                 <w:lang w:val="pt-BR"/>
               </w:rPr>
-              <w:t>99168-0835</w:t>
+              <w:t>99</w:t>
+            </w:r>
+            <w:r>
+              <w:rPr>
+                <w:noProof/>
+                <w:sz w:val="24"/>
+                <w:szCs w:val="24"/>
+                <w:lang w:val="pt-BR"/>
+              </w:rPr>
+              <w:t>949-0239</w:t>
             </w:r>
             <w:r>
               <w:rPr>
@@ -962,7 +979,16 @@
                 <w:szCs w:val="24"/>
                 <w:lang w:val="pt-BR"/>
               </w:rPr>
-              <w:t>larissinha0507@gmail.com</w:t>
+              <w:t>tarcisio.ribeiro.1840@hot</w:t>
+            </w:r>
+            <w:r>
+              <w:rPr>
+                <w:noProof/>
+                <w:sz w:val="24"/>
+                <w:szCs w:val="24"/>
+                <w:lang w:val="pt-BR"/>
+              </w:rPr>
+              <w:t>mail.com</w:t>
             </w:r>
             <w:r>
               <w:rPr>
@@ -1067,7 +1093,7 @@
                 <w:szCs w:val="24"/>
                 <w:lang w:val="pt-BR"/>
               </w:rPr>
-              <w:t>Decimus Serviços em Tecnologia Sociedade</w:t>
+              <w:t>Telluria Tecnologia S/A</w:t>
             </w:r>
             <w:r>
               <w:rPr>
@@ -1160,7 +1186,7 @@
                 <w:szCs w:val="24"/>
                 <w:lang w:val="pt-BR"/>
               </w:rPr>
-              <w:t>Desenvolvimento e licenciamento de programas de computador customizáveis</w:t>
+              <w:t>Desenvolvimento e licenciamento de programas de computador</w:t>
             </w:r>
             <w:r>
               <w:rPr>
@@ -1253,7 +1279,7 @@
                 <w:szCs w:val="24"/>
                 <w:lang w:val="pt-BR"/>
               </w:rPr>
-              <w:t>Luan Felipe Cintra Wüst</w:t>
+              <w:t>Marcos Roberto</w:t>
             </w:r>
             <w:r>
               <w:rPr>
@@ -1346,7 +1372,15 @@
                 <w:szCs w:val="24"/>
                 <w:lang w:val="pt-BR"/>
               </w:rPr>
-              <w:t>(16)3722-0077</w:t>
+              <w:t>(</w:t>
+            </w:r>
+            <w:r>
+              <w:rPr>
+                <w:sz w:val="24"/>
+                <w:szCs w:val="24"/>
+                <w:lang w:val="pt-BR"/>
+              </w:rPr>
+              <w:t>xx)-00000-0000</w:t>
             </w:r>
             <w:r>
               <w:rPr>
@@ -1443,7 +1477,7 @@
                 <w:szCs w:val="24"/>
                 <w:lang w:val="pt-BR"/>
               </w:rPr>
-              <w:t>luan.wust@audtax.com.br</w:t>
+              <w:t>l</w:t>
             </w:r>
             <w:r>
               <w:rPr>
@@ -2051,7 +2085,23 @@
                 <w:szCs w:val="24"/>
                 <w:lang w:val="pt-BR"/>
               </w:rPr>
-              <w:t xml:space="preserve"> de bugs.</w:t>
+              <w:t xml:space="preserve"> de </w:t>
+            </w:r>
+            <w:r>
+              <w:rPr>
+                <w:sz w:val="24"/>
+                <w:szCs w:val="24"/>
+                <w:lang w:val="pt-BR"/>
+              </w:rPr>
+              <w:t>erros</w:t>
+            </w:r>
+            <w:r>
+              <w:rPr>
+                <w:sz w:val="24"/>
+                <w:szCs w:val="24"/>
+                <w:lang w:val="pt-BR"/>
+              </w:rPr>
+              <w:t>.</w:t>
             </w:r>
             <w:r>
               <w:rPr>
@@ -2181,33 +2231,15 @@
                 <w:szCs w:val="24"/>
                 <w:lang w:val="pt-BR"/>
               </w:rPr>
-              <w:t>crito no quadro em anexo? Sim</w:t>
-            </w:r>
-            <w:proofErr w:type="gramStart"/>
-            <w:r>
-              <w:rPr>
-                <w:sz w:val="24"/>
-                <w:szCs w:val="24"/>
-                <w:lang w:val="pt-BR"/>
-              </w:rPr>
-              <w:t xml:space="preserve">  </w:t>
-            </w:r>
-            <w:r>
-              <w:rPr>
-                <w:sz w:val="24"/>
-                <w:szCs w:val="24"/>
-                <w:lang w:val="pt-BR"/>
-              </w:rPr>
-              <w:t xml:space="preserve"> (</w:t>
-            </w:r>
-            <w:proofErr w:type="gramEnd"/>
-            <w:r>
-              <w:rPr>
-                <w:sz w:val="24"/>
-                <w:szCs w:val="24"/>
-                <w:lang w:val="pt-BR"/>
-              </w:rPr>
-              <w:t xml:space="preserve">      )     Não   (      )     </w:t>
+              <w:t xml:space="preserve">crito no quadro em anexo? Sim  </w:t>
+            </w:r>
+            <w:r>
+              <w:rPr>
+                <w:sz w:val="24"/>
+                <w:szCs w:val="24"/>
+                <w:lang w:val="pt-BR"/>
+              </w:rPr>
+              <w:t xml:space="preserve"> (      )     Não   (      )     </w:t>
             </w:r>
           </w:p>
           <w:p>
@@ -2269,25 +2301,7 @@
                 <w:szCs w:val="24"/>
                 <w:lang w:val="pt-BR"/>
               </w:rPr>
-              <w:t xml:space="preserve">  Sim</w:t>
-            </w:r>
-            <w:proofErr w:type="gramStart"/>
-            <w:r>
-              <w:rPr>
-                <w:sz w:val="24"/>
-                <w:szCs w:val="24"/>
-                <w:lang w:val="pt-BR"/>
-              </w:rPr>
-              <w:t xml:space="preserve">   (</w:t>
-            </w:r>
-            <w:proofErr w:type="gramEnd"/>
-            <w:r>
-              <w:rPr>
-                <w:sz w:val="24"/>
-                <w:szCs w:val="24"/>
-                <w:lang w:val="pt-BR"/>
-              </w:rPr>
-              <w:t xml:space="preserve">      )    Não (      </w:t>
+              <w:t xml:space="preserve">  Sim   (      )    Não (      </w:t>
             </w:r>
             <w:r>
               <w:rPr>
@@ -2941,7 +2955,25 @@
                 <w:szCs w:val="24"/>
                 <w:lang w:val="pt-BR"/>
               </w:rPr>
-              <w:t>Correção de bugs e consultas em Bancos de Dados</w:t>
+              <w:t xml:space="preserve">Correção de </w:t>
+            </w:r>
+            <w:r>
+              <w:rPr>
+                <w:noProof/>
+                <w:sz w:val="24"/>
+                <w:szCs w:val="24"/>
+                <w:lang w:val="pt-BR"/>
+              </w:rPr>
+              <w:t>erros</w:t>
+            </w:r>
+            <w:r>
+              <w:rPr>
+                <w:noProof/>
+                <w:sz w:val="24"/>
+                <w:szCs w:val="24"/>
+                <w:lang w:val="pt-BR"/>
+              </w:rPr>
+              <w:t xml:space="preserve"> e consultas em Bancos de Dados</w:t>
             </w:r>
             <w:r>
               <w:rPr>

</xml_diff>

<commit_message>
Alterando os documentos do estágio.
</commit_message>
<xml_diff>
--- a/Faculdade/Plano-de-Trabalho.docx
+++ b/Faculdade/Plano-de-Trabalho.docx
@@ -1,6 +1,6 @@
 
 <file path=word/document.xml><?xml version="1.0" encoding="utf-8"?>
-<w:document xmlns:wpc="http://schemas.microsoft.com/office/word/2010/wordprocessingCanvas" xmlns:cx="http://schemas.microsoft.com/office/drawing/2014/chartex" xmlns:cx1="http://schemas.microsoft.com/office/drawing/2015/9/8/chartex" xmlns:cx2="http://schemas.microsoft.com/office/drawing/2015/10/21/chartex" xmlns:cx3="http://schemas.microsoft.com/office/drawing/2016/5/9/chartex" xmlns:cx4="http://schemas.microsoft.com/office/drawing/2016/5/10/chartex" xmlns:cx5="http://schemas.microsoft.com/office/drawing/2016/5/11/chartex" xmlns:cx6="http://schemas.microsoft.com/office/drawing/2016/5/12/chartex" xmlns:cx7="http://schemas.microsoft.com/office/drawing/2016/5/13/chartex" xmlns:cx8="http://schemas.microsoft.com/office/drawing/2016/5/14/chartex" xmlns:mc="http://schemas.openxmlformats.org/markup-compatibility/2006" xmlns:aink="http://schemas.microsoft.com/office/drawing/2016/ink" xmlns:am3d="http://schemas.microsoft.com/office/drawing/2017/model3d" xmlns:o="urn:schemas-microsoft-com:office:office" xmlns:r="http://schemas.openxmlformats.org/officeDocument/2006/relationships" xmlns:m="http://schemas.openxmlformats.org/officeDocument/2006/math" xmlns:v="urn:schemas-microsoft-com:vml" xmlns:wp14="http://schemas.microsoft.com/office/word/2010/wordprocessingDrawing" xmlns:wp="http://schemas.openxmlformats.org/drawingml/2006/wordprocessingDrawing" xmlns:w10="urn:schemas-microsoft-com:office:word" xmlns:w="http://schemas.openxmlformats.org/wordprocessingml/2006/main" xmlns:w14="http://schemas.microsoft.com/office/word/2010/wordml" xmlns:w15="http://schemas.microsoft.com/office/word/2012/wordml" xmlns:w16cex="http://schemas.microsoft.com/office/word/2018/wordml/cex" xmlns:w16cid="http://schemas.microsoft.com/office/word/2016/wordml/cid" xmlns:w16="http://schemas.microsoft.com/office/word/2018/wordml" xmlns:w16sdtdh="http://schemas.microsoft.com/office/word/2020/wordml/sdtdatahash" xmlns:w16se="http://schemas.microsoft.com/office/word/2015/wordml/symex" xmlns:wpg="http://schemas.microsoft.com/office/word/2010/wordprocessingGroup" xmlns:wpi="http://schemas.microsoft.com/office/word/2010/wordprocessingInk" xmlns:wne="http://schemas.microsoft.com/office/word/2006/wordml" xmlns:wps="http://schemas.microsoft.com/office/word/2010/wordprocessingShape" mc:Ignorable="w14 w15 w16se w16cid w16 w16cex w16sdtdh wp14">
+<w:document xmlns:wpc="http://schemas.microsoft.com/office/word/2010/wordprocessingCanvas" xmlns:cx="http://schemas.microsoft.com/office/drawing/2014/chartex" xmlns:cx1="http://schemas.microsoft.com/office/drawing/2015/9/8/chartex" xmlns:cx2="http://schemas.microsoft.com/office/drawing/2015/10/21/chartex" xmlns:cx3="http://schemas.microsoft.com/office/drawing/2016/5/9/chartex" xmlns:cx4="http://schemas.microsoft.com/office/drawing/2016/5/10/chartex" xmlns:cx5="http://schemas.microsoft.com/office/drawing/2016/5/11/chartex" xmlns:cx6="http://schemas.microsoft.com/office/drawing/2016/5/12/chartex" xmlns:cx7="http://schemas.microsoft.com/office/drawing/2016/5/13/chartex" xmlns:cx8="http://schemas.microsoft.com/office/drawing/2016/5/14/chartex" xmlns:mc="http://schemas.openxmlformats.org/markup-compatibility/2006" xmlns:aink="http://schemas.microsoft.com/office/drawing/2016/ink" xmlns:am3d="http://schemas.microsoft.com/office/drawing/2017/model3d" xmlns:o="urn:schemas-microsoft-com:office:office" xmlns:oel="http://schemas.microsoft.com/office/2019/extlst" xmlns:r="http://schemas.openxmlformats.org/officeDocument/2006/relationships" xmlns:m="http://schemas.openxmlformats.org/officeDocument/2006/math" xmlns:v="urn:schemas-microsoft-com:vml" xmlns:wp14="http://schemas.microsoft.com/office/word/2010/wordprocessingDrawing" xmlns:wp="http://schemas.openxmlformats.org/drawingml/2006/wordprocessingDrawing" xmlns:w10="urn:schemas-microsoft-com:office:word" xmlns:w="http://schemas.openxmlformats.org/wordprocessingml/2006/main" xmlns:w14="http://schemas.microsoft.com/office/word/2010/wordml" xmlns:w15="http://schemas.microsoft.com/office/word/2012/wordml" xmlns:w16cex="http://schemas.microsoft.com/office/word/2018/wordml/cex" xmlns:w16cid="http://schemas.microsoft.com/office/word/2016/wordml/cid" xmlns:w16="http://schemas.microsoft.com/office/word/2018/wordml" xmlns:w16sdtdh="http://schemas.microsoft.com/office/word/2020/wordml/sdtdatahash" xmlns:w16se="http://schemas.microsoft.com/office/word/2015/wordml/symex" xmlns:wpg="http://schemas.microsoft.com/office/word/2010/wordprocessingGroup" xmlns:wpi="http://schemas.microsoft.com/office/word/2010/wordprocessingInk" xmlns:wne="http://schemas.microsoft.com/office/word/2006/wordml" xmlns:wps="http://schemas.microsoft.com/office/word/2010/wordprocessingShape" mc:Ignorable="w14 w15 w16se w16cid w16 w16cex w16sdtdh wp14">
   <w:body>
     <w:sdt>
       <w:sdtPr>
@@ -11,6 +11,7 @@
           <w:lang w:val="pt-BR"/>
         </w:rPr>
         <w:id w:val="844362559"/>
+        <w:showingPlcHdr/>
         <w:picture/>
       </w:sdtPr>
       <w:sdtEndPr/>
@@ -33,13 +34,13 @@
               <w:color w:val="FF0000"/>
               <w:sz w:val="24"/>
               <w:szCs w:val="24"/>
-              <w:lang w:val="pt-BR" w:eastAsia="pt-BR"/>
+              <w:lang w:val="pt-BR"/>
             </w:rPr>
             <w:drawing>
-              <wp:inline distT="0" distB="0" distL="0" distR="0" wp14:anchorId="137A02FF" wp14:editId="618AE1B3">
-                <wp:extent cx="676275" cy="139511"/>
+              <wp:inline distT="0" distB="0" distL="0" distR="0" wp14:anchorId="4B721BDE" wp14:editId="41E8869A">
+                <wp:extent cx="1524000" cy="1524000"/>
                 <wp:effectExtent l="0" t="0" r="0" b="0"/>
-                <wp:docPr id="6" name="Imagem 6"/>
+                <wp:docPr id="3" name="Imagem 3"/>
                 <wp:cNvGraphicFramePr>
                   <a:graphicFrameLocks xmlns:a="http://schemas.openxmlformats.org/drawingml/2006/main" noChangeAspect="1"/>
                 </wp:cNvGraphicFramePr>
@@ -47,13 +48,20 @@
                   <a:graphicData uri="http://schemas.openxmlformats.org/drawingml/2006/picture">
                     <pic:pic xmlns:pic="http://schemas.openxmlformats.org/drawingml/2006/picture">
                       <pic:nvPicPr>
-                        <pic:cNvPr id="6" name="Imagem 6"/>
+                        <pic:cNvPr id="0" name="Picture 3"/>
                         <pic:cNvPicPr>
                           <a:picLocks noChangeAspect="1" noChangeArrowheads="1"/>
                         </pic:cNvPicPr>
                       </pic:nvPicPr>
                       <pic:blipFill>
-                        <a:blip r:embed="rId8"/>
+                        <a:blip r:embed="rId8">
+                          <a:extLst>
+                            <a:ext uri="{28A0092B-C50C-407E-A947-70E740481C1C}">
+                              <a14:useLocalDpi xmlns:a14="http://schemas.microsoft.com/office/drawing/2010/main" val="0"/>
+                            </a:ext>
+                          </a:extLst>
+                        </a:blip>
+                        <a:srcRect/>
                         <a:stretch>
                           <a:fillRect/>
                         </a:stretch>
@@ -61,7 +69,7 @@
                       <pic:spPr bwMode="auto">
                         <a:xfrm>
                           <a:off x="0" y="0"/>
-                          <a:ext cx="676275" cy="139511"/>
+                          <a:ext cx="1524000" cy="1524000"/>
                         </a:xfrm>
                         <a:prstGeom prst="rect">
                           <a:avLst/>
@@ -2231,15 +2239,33 @@
                 <w:szCs w:val="24"/>
                 <w:lang w:val="pt-BR"/>
               </w:rPr>
-              <w:t xml:space="preserve">crito no quadro em anexo? Sim  </w:t>
-            </w:r>
-            <w:r>
-              <w:rPr>
-                <w:sz w:val="24"/>
-                <w:szCs w:val="24"/>
-                <w:lang w:val="pt-BR"/>
-              </w:rPr>
-              <w:t xml:space="preserve"> (      )     Não   (      )     </w:t>
+              <w:t>crito no quadro em anexo? Sim</w:t>
+            </w:r>
+            <w:proofErr w:type="gramStart"/>
+            <w:r>
+              <w:rPr>
+                <w:sz w:val="24"/>
+                <w:szCs w:val="24"/>
+                <w:lang w:val="pt-BR"/>
+              </w:rPr>
+              <w:t xml:space="preserve">  </w:t>
+            </w:r>
+            <w:r>
+              <w:rPr>
+                <w:sz w:val="24"/>
+                <w:szCs w:val="24"/>
+                <w:lang w:val="pt-BR"/>
+              </w:rPr>
+              <w:t xml:space="preserve"> (</w:t>
+            </w:r>
+            <w:proofErr w:type="gramEnd"/>
+            <w:r>
+              <w:rPr>
+                <w:sz w:val="24"/>
+                <w:szCs w:val="24"/>
+                <w:lang w:val="pt-BR"/>
+              </w:rPr>
+              <w:t xml:space="preserve">      )     Não   (      )     </w:t>
             </w:r>
           </w:p>
           <w:p>
@@ -2301,7 +2327,25 @@
                 <w:szCs w:val="24"/>
                 <w:lang w:val="pt-BR"/>
               </w:rPr>
-              <w:t xml:space="preserve">  Sim   (      )    Não (      </w:t>
+              <w:t xml:space="preserve">  Sim</w:t>
+            </w:r>
+            <w:proofErr w:type="gramStart"/>
+            <w:r>
+              <w:rPr>
+                <w:sz w:val="24"/>
+                <w:szCs w:val="24"/>
+                <w:lang w:val="pt-BR"/>
+              </w:rPr>
+              <w:t xml:space="preserve">   (</w:t>
+            </w:r>
+            <w:proofErr w:type="gramEnd"/>
+            <w:r>
+              <w:rPr>
+                <w:sz w:val="24"/>
+                <w:szCs w:val="24"/>
+                <w:lang w:val="pt-BR"/>
+              </w:rPr>
+              <w:t xml:space="preserve">      )    Não (      </w:t>
             </w:r>
             <w:r>
               <w:rPr>
@@ -2549,7 +2593,23 @@
                 <w:szCs w:val="24"/>
                 <w:lang w:val="pt-BR"/>
               </w:rPr>
-              <w:t>Prestar suporte, realizar treinamentos e reuniões mensais do sistema com os clientes</w:t>
+              <w:t>Prestar suporte</w:t>
+            </w:r>
+            <w:r>
+              <w:rPr>
+                <w:sz w:val="24"/>
+                <w:szCs w:val="24"/>
+                <w:lang w:val="pt-BR"/>
+              </w:rPr>
+              <w:t xml:space="preserve"> </w:t>
+            </w:r>
+            <w:r>
+              <w:rPr>
+                <w:sz w:val="24"/>
+                <w:szCs w:val="24"/>
+                <w:lang w:val="pt-BR"/>
+              </w:rPr>
+              <w:t>do sistema com os clientes</w:t>
             </w:r>
             <w:r>
               <w:rPr>
@@ -4583,7 +4643,7 @@
 </file>
 
 <file path=word/endnotes.xml><?xml version="1.0" encoding="utf-8"?>
-<w:endnotes xmlns:wpc="http://schemas.microsoft.com/office/word/2010/wordprocessingCanvas" xmlns:cx="http://schemas.microsoft.com/office/drawing/2014/chartex" xmlns:cx1="http://schemas.microsoft.com/office/drawing/2015/9/8/chartex" xmlns:cx2="http://schemas.microsoft.com/office/drawing/2015/10/21/chartex" xmlns:cx3="http://schemas.microsoft.com/office/drawing/2016/5/9/chartex" xmlns:cx4="http://schemas.microsoft.com/office/drawing/2016/5/10/chartex" xmlns:cx5="http://schemas.microsoft.com/office/drawing/2016/5/11/chartex" xmlns:cx6="http://schemas.microsoft.com/office/drawing/2016/5/12/chartex" xmlns:cx7="http://schemas.microsoft.com/office/drawing/2016/5/13/chartex" xmlns:cx8="http://schemas.microsoft.com/office/drawing/2016/5/14/chartex" xmlns:mc="http://schemas.openxmlformats.org/markup-compatibility/2006" xmlns:aink="http://schemas.microsoft.com/office/drawing/2016/ink" xmlns:am3d="http://schemas.microsoft.com/office/drawing/2017/model3d" xmlns:o="urn:schemas-microsoft-com:office:office" xmlns:r="http://schemas.openxmlformats.org/officeDocument/2006/relationships" xmlns:m="http://schemas.openxmlformats.org/officeDocument/2006/math" xmlns:v="urn:schemas-microsoft-com:vml" xmlns:wp14="http://schemas.microsoft.com/office/word/2010/wordprocessingDrawing" xmlns:wp="http://schemas.openxmlformats.org/drawingml/2006/wordprocessingDrawing" xmlns:w10="urn:schemas-microsoft-com:office:word" xmlns:w="http://schemas.openxmlformats.org/wordprocessingml/2006/main" xmlns:w14="http://schemas.microsoft.com/office/word/2010/wordml" xmlns:w15="http://schemas.microsoft.com/office/word/2012/wordml" xmlns:w16cex="http://schemas.microsoft.com/office/word/2018/wordml/cex" xmlns:w16cid="http://schemas.microsoft.com/office/word/2016/wordml/cid" xmlns:w16="http://schemas.microsoft.com/office/word/2018/wordml" xmlns:w16sdtdh="http://schemas.microsoft.com/office/word/2020/wordml/sdtdatahash" xmlns:w16se="http://schemas.microsoft.com/office/word/2015/wordml/symex" xmlns:wpg="http://schemas.microsoft.com/office/word/2010/wordprocessingGroup" xmlns:wpi="http://schemas.microsoft.com/office/word/2010/wordprocessingInk" xmlns:wne="http://schemas.microsoft.com/office/word/2006/wordml" xmlns:wps="http://schemas.microsoft.com/office/word/2010/wordprocessingShape" mc:Ignorable="w14 w15 w16se w16cid w16 w16cex w16sdtdh wp14">
+<w:endnotes xmlns:wpc="http://schemas.microsoft.com/office/word/2010/wordprocessingCanvas" xmlns:cx="http://schemas.microsoft.com/office/drawing/2014/chartex" xmlns:cx1="http://schemas.microsoft.com/office/drawing/2015/9/8/chartex" xmlns:cx2="http://schemas.microsoft.com/office/drawing/2015/10/21/chartex" xmlns:cx3="http://schemas.microsoft.com/office/drawing/2016/5/9/chartex" xmlns:cx4="http://schemas.microsoft.com/office/drawing/2016/5/10/chartex" xmlns:cx5="http://schemas.microsoft.com/office/drawing/2016/5/11/chartex" xmlns:cx6="http://schemas.microsoft.com/office/drawing/2016/5/12/chartex" xmlns:cx7="http://schemas.microsoft.com/office/drawing/2016/5/13/chartex" xmlns:cx8="http://schemas.microsoft.com/office/drawing/2016/5/14/chartex" xmlns:mc="http://schemas.openxmlformats.org/markup-compatibility/2006" xmlns:aink="http://schemas.microsoft.com/office/drawing/2016/ink" xmlns:am3d="http://schemas.microsoft.com/office/drawing/2017/model3d" xmlns:o="urn:schemas-microsoft-com:office:office" xmlns:oel="http://schemas.microsoft.com/office/2019/extlst" xmlns:r="http://schemas.openxmlformats.org/officeDocument/2006/relationships" xmlns:m="http://schemas.openxmlformats.org/officeDocument/2006/math" xmlns:v="urn:schemas-microsoft-com:vml" xmlns:wp14="http://schemas.microsoft.com/office/word/2010/wordprocessingDrawing" xmlns:wp="http://schemas.openxmlformats.org/drawingml/2006/wordprocessingDrawing" xmlns:w10="urn:schemas-microsoft-com:office:word" xmlns:w="http://schemas.openxmlformats.org/wordprocessingml/2006/main" xmlns:w14="http://schemas.microsoft.com/office/word/2010/wordml" xmlns:w15="http://schemas.microsoft.com/office/word/2012/wordml" xmlns:w16cex="http://schemas.microsoft.com/office/word/2018/wordml/cex" xmlns:w16cid="http://schemas.microsoft.com/office/word/2016/wordml/cid" xmlns:w16="http://schemas.microsoft.com/office/word/2018/wordml" xmlns:w16sdtdh="http://schemas.microsoft.com/office/word/2020/wordml/sdtdatahash" xmlns:w16se="http://schemas.microsoft.com/office/word/2015/wordml/symex" xmlns:wpg="http://schemas.microsoft.com/office/word/2010/wordprocessingGroup" xmlns:wpi="http://schemas.microsoft.com/office/word/2010/wordprocessingInk" xmlns:wne="http://schemas.microsoft.com/office/word/2006/wordml" xmlns:wps="http://schemas.microsoft.com/office/word/2010/wordprocessingShape" mc:Ignorable="w14 w15 w16se w16cid w16 w16cex w16sdtdh wp14">
   <w:endnote w:type="separator" w:id="-1">
     <w:p>
       <w:r>
@@ -4602,7 +4662,7 @@
 </file>
 
 <file path=word/footer1.xml><?xml version="1.0" encoding="utf-8"?>
-<w:ftr xmlns:wpc="http://schemas.microsoft.com/office/word/2010/wordprocessingCanvas" xmlns:cx="http://schemas.microsoft.com/office/drawing/2014/chartex" xmlns:cx1="http://schemas.microsoft.com/office/drawing/2015/9/8/chartex" xmlns:cx2="http://schemas.microsoft.com/office/drawing/2015/10/21/chartex" xmlns:cx3="http://schemas.microsoft.com/office/drawing/2016/5/9/chartex" xmlns:cx4="http://schemas.microsoft.com/office/drawing/2016/5/10/chartex" xmlns:cx5="http://schemas.microsoft.com/office/drawing/2016/5/11/chartex" xmlns:cx6="http://schemas.microsoft.com/office/drawing/2016/5/12/chartex" xmlns:cx7="http://schemas.microsoft.com/office/drawing/2016/5/13/chartex" xmlns:cx8="http://schemas.microsoft.com/office/drawing/2016/5/14/chartex" xmlns:mc="http://schemas.openxmlformats.org/markup-compatibility/2006" xmlns:aink="http://schemas.microsoft.com/office/drawing/2016/ink" xmlns:am3d="http://schemas.microsoft.com/office/drawing/2017/model3d" xmlns:o="urn:schemas-microsoft-com:office:office" xmlns:r="http://schemas.openxmlformats.org/officeDocument/2006/relationships" xmlns:m="http://schemas.openxmlformats.org/officeDocument/2006/math" xmlns:v="urn:schemas-microsoft-com:vml" xmlns:wp14="http://schemas.microsoft.com/office/word/2010/wordprocessingDrawing" xmlns:wp="http://schemas.openxmlformats.org/drawingml/2006/wordprocessingDrawing" xmlns:w10="urn:schemas-microsoft-com:office:word" xmlns:w="http://schemas.openxmlformats.org/wordprocessingml/2006/main" xmlns:w14="http://schemas.microsoft.com/office/word/2010/wordml" xmlns:w15="http://schemas.microsoft.com/office/word/2012/wordml" xmlns:w16cex="http://schemas.microsoft.com/office/word/2018/wordml/cex" xmlns:w16cid="http://schemas.microsoft.com/office/word/2016/wordml/cid" xmlns:w16="http://schemas.microsoft.com/office/word/2018/wordml" xmlns:w16sdtdh="http://schemas.microsoft.com/office/word/2020/wordml/sdtdatahash" xmlns:w16se="http://schemas.microsoft.com/office/word/2015/wordml/symex" xmlns:wpg="http://schemas.microsoft.com/office/word/2010/wordprocessingGroup" xmlns:wpi="http://schemas.microsoft.com/office/word/2010/wordprocessingInk" xmlns:wne="http://schemas.microsoft.com/office/word/2006/wordml" xmlns:wps="http://schemas.microsoft.com/office/word/2010/wordprocessingShape" mc:Ignorable="w14 w15 w16se w16cid w16 w16cex w16sdtdh wp14">
+<w:ftr xmlns:wpc="http://schemas.microsoft.com/office/word/2010/wordprocessingCanvas" xmlns:cx="http://schemas.microsoft.com/office/drawing/2014/chartex" xmlns:cx1="http://schemas.microsoft.com/office/drawing/2015/9/8/chartex" xmlns:cx2="http://schemas.microsoft.com/office/drawing/2015/10/21/chartex" xmlns:cx3="http://schemas.microsoft.com/office/drawing/2016/5/9/chartex" xmlns:cx4="http://schemas.microsoft.com/office/drawing/2016/5/10/chartex" xmlns:cx5="http://schemas.microsoft.com/office/drawing/2016/5/11/chartex" xmlns:cx6="http://schemas.microsoft.com/office/drawing/2016/5/12/chartex" xmlns:cx7="http://schemas.microsoft.com/office/drawing/2016/5/13/chartex" xmlns:cx8="http://schemas.microsoft.com/office/drawing/2016/5/14/chartex" xmlns:mc="http://schemas.openxmlformats.org/markup-compatibility/2006" xmlns:aink="http://schemas.microsoft.com/office/drawing/2016/ink" xmlns:am3d="http://schemas.microsoft.com/office/drawing/2017/model3d" xmlns:o="urn:schemas-microsoft-com:office:office" xmlns:oel="http://schemas.microsoft.com/office/2019/extlst" xmlns:r="http://schemas.openxmlformats.org/officeDocument/2006/relationships" xmlns:m="http://schemas.openxmlformats.org/officeDocument/2006/math" xmlns:v="urn:schemas-microsoft-com:vml" xmlns:wp14="http://schemas.microsoft.com/office/word/2010/wordprocessingDrawing" xmlns:wp="http://schemas.openxmlformats.org/drawingml/2006/wordprocessingDrawing" xmlns:w10="urn:schemas-microsoft-com:office:word" xmlns:w="http://schemas.openxmlformats.org/wordprocessingml/2006/main" xmlns:w14="http://schemas.microsoft.com/office/word/2010/wordml" xmlns:w15="http://schemas.microsoft.com/office/word/2012/wordml" xmlns:w16cex="http://schemas.microsoft.com/office/word/2018/wordml/cex" xmlns:w16cid="http://schemas.microsoft.com/office/word/2016/wordml/cid" xmlns:w16="http://schemas.microsoft.com/office/word/2018/wordml" xmlns:w16sdtdh="http://schemas.microsoft.com/office/word/2020/wordml/sdtdatahash" xmlns:w16se="http://schemas.microsoft.com/office/word/2015/wordml/symex" xmlns:wpg="http://schemas.microsoft.com/office/word/2010/wordprocessingGroup" xmlns:wpi="http://schemas.microsoft.com/office/word/2010/wordprocessingInk" xmlns:wne="http://schemas.microsoft.com/office/word/2006/wordml" xmlns:wps="http://schemas.microsoft.com/office/word/2010/wordprocessingShape" mc:Ignorable="w14 w15 w16se w16cid w16 w16cex w16sdtdh wp14">
   <w:p>
     <w:pPr>
       <w:spacing w:line="0" w:lineRule="atLeast"/>
@@ -4616,7 +4676,7 @@
 </file>
 
 <file path=word/footnotes.xml><?xml version="1.0" encoding="utf-8"?>
-<w:footnotes xmlns:wpc="http://schemas.microsoft.com/office/word/2010/wordprocessingCanvas" xmlns:cx="http://schemas.microsoft.com/office/drawing/2014/chartex" xmlns:cx1="http://schemas.microsoft.com/office/drawing/2015/9/8/chartex" xmlns:cx2="http://schemas.microsoft.com/office/drawing/2015/10/21/chartex" xmlns:cx3="http://schemas.microsoft.com/office/drawing/2016/5/9/chartex" xmlns:cx4="http://schemas.microsoft.com/office/drawing/2016/5/10/chartex" xmlns:cx5="http://schemas.microsoft.com/office/drawing/2016/5/11/chartex" xmlns:cx6="http://schemas.microsoft.com/office/drawing/2016/5/12/chartex" xmlns:cx7="http://schemas.microsoft.com/office/drawing/2016/5/13/chartex" xmlns:cx8="http://schemas.microsoft.com/office/drawing/2016/5/14/chartex" xmlns:mc="http://schemas.openxmlformats.org/markup-compatibility/2006" xmlns:aink="http://schemas.microsoft.com/office/drawing/2016/ink" xmlns:am3d="http://schemas.microsoft.com/office/drawing/2017/model3d" xmlns:o="urn:schemas-microsoft-com:office:office" xmlns:r="http://schemas.openxmlformats.org/officeDocument/2006/relationships" xmlns:m="http://schemas.openxmlformats.org/officeDocument/2006/math" xmlns:v="urn:schemas-microsoft-com:vml" xmlns:wp14="http://schemas.microsoft.com/office/word/2010/wordprocessingDrawing" xmlns:wp="http://schemas.openxmlformats.org/drawingml/2006/wordprocessingDrawing" xmlns:w10="urn:schemas-microsoft-com:office:word" xmlns:w="http://schemas.openxmlformats.org/wordprocessingml/2006/main" xmlns:w14="http://schemas.microsoft.com/office/word/2010/wordml" xmlns:w15="http://schemas.microsoft.com/office/word/2012/wordml" xmlns:w16cex="http://schemas.microsoft.com/office/word/2018/wordml/cex" xmlns:w16cid="http://schemas.microsoft.com/office/word/2016/wordml/cid" xmlns:w16="http://schemas.microsoft.com/office/word/2018/wordml" xmlns:w16sdtdh="http://schemas.microsoft.com/office/word/2020/wordml/sdtdatahash" xmlns:w16se="http://schemas.microsoft.com/office/word/2015/wordml/symex" xmlns:wpg="http://schemas.microsoft.com/office/word/2010/wordprocessingGroup" xmlns:wpi="http://schemas.microsoft.com/office/word/2010/wordprocessingInk" xmlns:wne="http://schemas.microsoft.com/office/word/2006/wordml" xmlns:wps="http://schemas.microsoft.com/office/word/2010/wordprocessingShape" mc:Ignorable="w14 w15 w16se w16cid w16 w16cex w16sdtdh wp14">
+<w:footnotes xmlns:wpc="http://schemas.microsoft.com/office/word/2010/wordprocessingCanvas" xmlns:cx="http://schemas.microsoft.com/office/drawing/2014/chartex" xmlns:cx1="http://schemas.microsoft.com/office/drawing/2015/9/8/chartex" xmlns:cx2="http://schemas.microsoft.com/office/drawing/2015/10/21/chartex" xmlns:cx3="http://schemas.microsoft.com/office/drawing/2016/5/9/chartex" xmlns:cx4="http://schemas.microsoft.com/office/drawing/2016/5/10/chartex" xmlns:cx5="http://schemas.microsoft.com/office/drawing/2016/5/11/chartex" xmlns:cx6="http://schemas.microsoft.com/office/drawing/2016/5/12/chartex" xmlns:cx7="http://schemas.microsoft.com/office/drawing/2016/5/13/chartex" xmlns:cx8="http://schemas.microsoft.com/office/drawing/2016/5/14/chartex" xmlns:mc="http://schemas.openxmlformats.org/markup-compatibility/2006" xmlns:aink="http://schemas.microsoft.com/office/drawing/2016/ink" xmlns:am3d="http://schemas.microsoft.com/office/drawing/2017/model3d" xmlns:o="urn:schemas-microsoft-com:office:office" xmlns:oel="http://schemas.microsoft.com/office/2019/extlst" xmlns:r="http://schemas.openxmlformats.org/officeDocument/2006/relationships" xmlns:m="http://schemas.openxmlformats.org/officeDocument/2006/math" xmlns:v="urn:schemas-microsoft-com:vml" xmlns:wp14="http://schemas.microsoft.com/office/word/2010/wordprocessingDrawing" xmlns:wp="http://schemas.openxmlformats.org/drawingml/2006/wordprocessingDrawing" xmlns:w10="urn:schemas-microsoft-com:office:word" xmlns:w="http://schemas.openxmlformats.org/wordprocessingml/2006/main" xmlns:w14="http://schemas.microsoft.com/office/word/2010/wordml" xmlns:w15="http://schemas.microsoft.com/office/word/2012/wordml" xmlns:w16cex="http://schemas.microsoft.com/office/word/2018/wordml/cex" xmlns:w16cid="http://schemas.microsoft.com/office/word/2016/wordml/cid" xmlns:w16="http://schemas.microsoft.com/office/word/2018/wordml" xmlns:w16sdtdh="http://schemas.microsoft.com/office/word/2020/wordml/sdtdatahash" xmlns:w16se="http://schemas.microsoft.com/office/word/2015/wordml/symex" xmlns:wpg="http://schemas.microsoft.com/office/word/2010/wordprocessingGroup" xmlns:wpi="http://schemas.microsoft.com/office/word/2010/wordprocessingInk" xmlns:wne="http://schemas.microsoft.com/office/word/2006/wordml" xmlns:wps="http://schemas.microsoft.com/office/word/2010/wordprocessingShape" mc:Ignorable="w14 w15 w16se w16cid w16 w16cex w16sdtdh wp14">
   <w:footnote w:type="separator" w:id="-1">
     <w:p>
       <w:r>
@@ -4635,7 +4695,7 @@
 </file>
 
 <file path=word/numbering.xml><?xml version="1.0" encoding="utf-8"?>
-<w:numbering xmlns:wpc="http://schemas.microsoft.com/office/word/2010/wordprocessingCanvas" xmlns:cx="http://schemas.microsoft.com/office/drawing/2014/chartex" xmlns:cx1="http://schemas.microsoft.com/office/drawing/2015/9/8/chartex" xmlns:cx2="http://schemas.microsoft.com/office/drawing/2015/10/21/chartex" xmlns:cx3="http://schemas.microsoft.com/office/drawing/2016/5/9/chartex" xmlns:cx4="http://schemas.microsoft.com/office/drawing/2016/5/10/chartex" xmlns:cx5="http://schemas.microsoft.com/office/drawing/2016/5/11/chartex" xmlns:cx6="http://schemas.microsoft.com/office/drawing/2016/5/12/chartex" xmlns:cx7="http://schemas.microsoft.com/office/drawing/2016/5/13/chartex" xmlns:cx8="http://schemas.microsoft.com/office/drawing/2016/5/14/chartex" xmlns:mc="http://schemas.openxmlformats.org/markup-compatibility/2006" xmlns:aink="http://schemas.microsoft.com/office/drawing/2016/ink" xmlns:am3d="http://schemas.microsoft.com/office/drawing/2017/model3d" xmlns:o="urn:schemas-microsoft-com:office:office" xmlns:r="http://schemas.openxmlformats.org/officeDocument/2006/relationships" xmlns:m="http://schemas.openxmlformats.org/officeDocument/2006/math" xmlns:v="urn:schemas-microsoft-com:vml" xmlns:wp14="http://schemas.microsoft.com/office/word/2010/wordprocessingDrawing" xmlns:wp="http://schemas.openxmlformats.org/drawingml/2006/wordprocessingDrawing" xmlns:w10="urn:schemas-microsoft-com:office:word" xmlns:w="http://schemas.openxmlformats.org/wordprocessingml/2006/main" xmlns:w14="http://schemas.microsoft.com/office/word/2010/wordml" xmlns:w15="http://schemas.microsoft.com/office/word/2012/wordml" xmlns:w16cex="http://schemas.microsoft.com/office/word/2018/wordml/cex" xmlns:w16cid="http://schemas.microsoft.com/office/word/2016/wordml/cid" xmlns:w16="http://schemas.microsoft.com/office/word/2018/wordml" xmlns:w16sdtdh="http://schemas.microsoft.com/office/word/2020/wordml/sdtdatahash" xmlns:w16se="http://schemas.microsoft.com/office/word/2015/wordml/symex" xmlns:wpg="http://schemas.microsoft.com/office/word/2010/wordprocessingGroup" xmlns:wpi="http://schemas.microsoft.com/office/word/2010/wordprocessingInk" xmlns:wne="http://schemas.microsoft.com/office/word/2006/wordml" xmlns:wps="http://schemas.microsoft.com/office/word/2010/wordprocessingShape" mc:Ignorable="w14 w15 w16se w16cid w16 w16cex w16sdtdh wp14">
+<w:numbering xmlns:wpc="http://schemas.microsoft.com/office/word/2010/wordprocessingCanvas" xmlns:cx="http://schemas.microsoft.com/office/drawing/2014/chartex" xmlns:cx1="http://schemas.microsoft.com/office/drawing/2015/9/8/chartex" xmlns:cx2="http://schemas.microsoft.com/office/drawing/2015/10/21/chartex" xmlns:cx3="http://schemas.microsoft.com/office/drawing/2016/5/9/chartex" xmlns:cx4="http://schemas.microsoft.com/office/drawing/2016/5/10/chartex" xmlns:cx5="http://schemas.microsoft.com/office/drawing/2016/5/11/chartex" xmlns:cx6="http://schemas.microsoft.com/office/drawing/2016/5/12/chartex" xmlns:cx7="http://schemas.microsoft.com/office/drawing/2016/5/13/chartex" xmlns:cx8="http://schemas.microsoft.com/office/drawing/2016/5/14/chartex" xmlns:mc="http://schemas.openxmlformats.org/markup-compatibility/2006" xmlns:aink="http://schemas.microsoft.com/office/drawing/2016/ink" xmlns:am3d="http://schemas.microsoft.com/office/drawing/2017/model3d" xmlns:o="urn:schemas-microsoft-com:office:office" xmlns:oel="http://schemas.microsoft.com/office/2019/extlst" xmlns:r="http://schemas.openxmlformats.org/officeDocument/2006/relationships" xmlns:m="http://schemas.openxmlformats.org/officeDocument/2006/math" xmlns:v="urn:schemas-microsoft-com:vml" xmlns:wp14="http://schemas.microsoft.com/office/word/2010/wordprocessingDrawing" xmlns:wp="http://schemas.openxmlformats.org/drawingml/2006/wordprocessingDrawing" xmlns:w10="urn:schemas-microsoft-com:office:word" xmlns:w="http://schemas.openxmlformats.org/wordprocessingml/2006/main" xmlns:w14="http://schemas.microsoft.com/office/word/2010/wordml" xmlns:w15="http://schemas.microsoft.com/office/word/2012/wordml" xmlns:w16cex="http://schemas.microsoft.com/office/word/2018/wordml/cex" xmlns:w16cid="http://schemas.microsoft.com/office/word/2016/wordml/cid" xmlns:w16="http://schemas.microsoft.com/office/word/2018/wordml" xmlns:w16sdtdh="http://schemas.microsoft.com/office/word/2020/wordml/sdtdatahash" xmlns:w16se="http://schemas.microsoft.com/office/word/2015/wordml/symex" xmlns:wpg="http://schemas.microsoft.com/office/word/2010/wordprocessingGroup" xmlns:wpi="http://schemas.microsoft.com/office/word/2010/wordprocessingInk" xmlns:wne="http://schemas.microsoft.com/office/word/2006/wordml" xmlns:wps="http://schemas.microsoft.com/office/word/2010/wordprocessingShape" mc:Ignorable="w14 w15 w16se w16cid w16 w16cex w16sdtdh wp14">
   <w:abstractNum w:abstractNumId="0" w15:restartNumberingAfterBreak="0">
     <w:nsid w:val="37213547"/>
     <w:multiLevelType w:val="multilevel"/>
@@ -5227,22 +5287,22 @@
       </w:pPr>
     </w:lvl>
   </w:abstractNum>
-  <w:num w:numId="1">
+  <w:num w:numId="1" w16cid:durableId="350375721">
     <w:abstractNumId w:val="0"/>
   </w:num>
-  <w:num w:numId="2">
+  <w:num w:numId="2" w16cid:durableId="1532914871">
     <w:abstractNumId w:val="4"/>
   </w:num>
-  <w:num w:numId="3">
+  <w:num w:numId="3" w16cid:durableId="1570384217">
     <w:abstractNumId w:val="5"/>
   </w:num>
-  <w:num w:numId="4">
+  <w:num w:numId="4" w16cid:durableId="1388144730">
     <w:abstractNumId w:val="2"/>
   </w:num>
-  <w:num w:numId="5">
+  <w:num w:numId="5" w16cid:durableId="1948809254">
     <w:abstractNumId w:val="1"/>
   </w:num>
-  <w:num w:numId="6">
+  <w:num w:numId="6" w16cid:durableId="833297100">
     <w:abstractNumId w:val="3"/>
   </w:num>
 </w:numbering>

</xml_diff>